<commit_message>
refactor de providers de datos de mercado
</commit_message>
<xml_diff>
--- a/docs/Documentacion - Diaz Rocio (3ra entrega).docx
+++ b/docs/Documentacion - Diaz Rocio (3ra entrega).docx
@@ -967,7 +967,6 @@
             <w:tabs>
               <w:tab w:val="right" w:leader="dot" w:pos="9360"/>
             </w:tabs>
-            <w:ind w:left="9360" w:hanging="9195"/>
             <w:rPr>
               <w:rFonts w:asciiTheme="minorHAnsi" w:eastAsiaTheme="minorEastAsia" w:hAnsiTheme="minorHAnsi" w:cstheme="minorBidi"/>
               <w:b w:val="0"/>
@@ -16190,65 +16189,6 @@
     </w:p>
     <w:p>
       <w:pPr>
-        <w:numPr>
-          <w:ilvl w:val="0"/>
-          <w:numId w:val="15"/>
-        </w:numPr>
-        <w:spacing w:line="480" w:lineRule="auto"/>
-        <w:jc w:val="both"/>
-        <w:rPr>
-          <w:rFonts w:ascii="Arial" w:hAnsi="Arial" w:cs="Arial"/>
-        </w:rPr>
-      </w:pPr>
-      <w:r>
-        <w:lastRenderedPageBreak/>
-        <w:t>Para optimizar el consumo de datos en tiempo real provenientes del proveedor externo, el sistema incorpora un mecanismo de caché intermedio. Los datos de mercado (precios, variaciones, etc.) no se consultan directamente al proveedor en cada solicitud, sino que se obtienen desde esta capa de caché.</w:t>
-      </w:r>
-    </w:p>
-    <w:p>
-      <w:pPr>
-        <w:numPr>
-          <w:ilvl w:val="0"/>
-          <w:numId w:val="15"/>
-        </w:numPr>
-        <w:spacing w:line="480" w:lineRule="auto"/>
-        <w:jc w:val="both"/>
-        <w:rPr>
-          <w:rFonts w:ascii="Arial" w:hAnsi="Arial" w:cs="Arial"/>
-        </w:rPr>
-      </w:pPr>
-      <w:r>
-        <w:t>Este caché se actualiza periódicamente —actualmente cada 3 minutos— mediante un intervalo configurable, lo que permite ajustar la frecuencia de actualización según las necesidades de rendimiento y consumo del sistema. De esta manera, se reduce la cantidad de llamadas al proveedor externo (Yahoo Finance) y se mejora la performance general del sistema.</w:t>
-      </w:r>
-    </w:p>
-    <w:p>
-      <w:pPr>
-        <w:numPr>
-          <w:ilvl w:val="0"/>
-          <w:numId w:val="15"/>
-        </w:numPr>
-        <w:spacing w:line="480" w:lineRule="auto"/>
-        <w:jc w:val="both"/>
-        <w:rPr>
-          <w:rFonts w:ascii="Arial" w:hAnsi="Arial" w:cs="Arial"/>
-        </w:rPr>
-      </w:pPr>
-      <w:r>
-        <w:t>Cabe destacar que las operaciones críticas, como la compra y venta de activos, no utilizan esta caché: dichas operaciones consultan siempre datos actualizados en tiempo real, garantizando la consistencia de la información al momento de ejecutar la transacción.</w:t>
-      </w:r>
-    </w:p>
-    <w:p>
-      <w:pPr>
-        <w:spacing w:line="480" w:lineRule="auto"/>
-        <w:ind w:left="1440"/>
-        <w:jc w:val="both"/>
-        <w:rPr>
-          <w:rFonts w:ascii="Arial" w:hAnsi="Arial" w:cs="Arial"/>
-        </w:rPr>
-      </w:pPr>
-    </w:p>
-    <w:p>
-      <w:pPr>
         <w:pStyle w:val="Ttulo2"/>
         <w:numPr>
           <w:ilvl w:val="0"/>
@@ -16265,6 +16205,7 @@
         <w:rPr>
           <w:rFonts w:eastAsia="Calibri" w:cs="Arial"/>
         </w:rPr>
+        <w:lastRenderedPageBreak/>
         <w:t>Control</w:t>
       </w:r>
       <w:r>
@@ -16453,7 +16394,6 @@
           <w:rFonts w:ascii="Arial" w:hAnsi="Arial" w:cs="Arial"/>
           <w:b/>
         </w:rPr>
-        <w:lastRenderedPageBreak/>
         <w:t>Swagger</w:t>
       </w:r>
       <w:proofErr w:type="spellEnd"/>
@@ -16659,6 +16599,7 @@
       </w:pPr>
       <w:bookmarkStart w:id="23" w:name="_Toc230024385"/>
       <w:r>
+        <w:lastRenderedPageBreak/>
         <w:t>Criterios</w:t>
       </w:r>
       <w:r>
@@ -17032,6 +16973,7 @@
         <w:rPr>
           <w:rFonts w:ascii="Arial" w:hAnsi="Arial" w:cs="Arial"/>
         </w:rPr>
+        <w:lastRenderedPageBreak/>
         <w:t>El usuario debe poder registrar operaciones de compra y venta de activos.</w:t>
       </w:r>
     </w:p>
@@ -17238,7 +17180,6 @@
         <w:rPr>
           <w:rFonts w:ascii="Arial" w:hAnsi="Arial" w:cs="Arial"/>
         </w:rPr>
-        <w:lastRenderedPageBreak/>
         <w:t>El usuario debe poder gestionar sus alertas en todo momento.</w:t>
       </w:r>
     </w:p>
@@ -17443,6 +17384,7 @@
         <w:rPr>
           <w:rFonts w:ascii="Arial" w:hAnsi="Arial" w:cs="Arial"/>
         </w:rPr>
+        <w:lastRenderedPageBreak/>
         <w:t>Los datos históricos y de mercado deben gestionarse mediante MongoDB.</w:t>
       </w:r>
     </w:p>
@@ -17761,6 +17703,7 @@
       </w:pPr>
       <w:bookmarkStart w:id="31" w:name="_Toc230024393"/>
       <w:r>
+        <w:lastRenderedPageBreak/>
         <w:t>Metodologías</w:t>
       </w:r>
       <w:bookmarkEnd w:id="31"/>
@@ -17851,7 +17794,6 @@
           <w:szCs w:val="24"/>
           <w:lang w:val="es-AR" w:eastAsia="es-AR"/>
         </w:rPr>
-        <w:lastRenderedPageBreak/>
         <w:t>A continuación, se describen las principales etapas del desarrollo del proyecto:</w:t>
       </w:r>
     </w:p>
@@ -18023,6 +17965,7 @@
           <w:rFonts w:eastAsia="Times New Roman" w:cs="Arial"/>
           <w:lang w:val="es-AR" w:eastAsia="es-AR"/>
         </w:rPr>
+        <w:lastRenderedPageBreak/>
         <w:t>Diseño de la solución</w:t>
       </w:r>
       <w:bookmarkEnd w:id="33"/>
@@ -18196,7 +18139,6 @@
           <w:rFonts w:eastAsia="Times New Roman" w:cs="Arial"/>
           <w:lang w:val="es-AR" w:eastAsia="es-AR"/>
         </w:rPr>
-        <w:lastRenderedPageBreak/>
         <w:t>Desarrollo e implementación</w:t>
       </w:r>
       <w:bookmarkEnd w:id="34"/>
@@ -18347,6 +18289,7 @@
           <w:szCs w:val="24"/>
           <w:lang w:val="es-AR" w:eastAsia="es-AR"/>
         </w:rPr>
+        <w:lastRenderedPageBreak/>
         <w:t xml:space="preserve">Integración con servicios externos (Yahoo Finance). </w:t>
       </w:r>
     </w:p>
@@ -18584,7 +18527,6 @@
           <w:rFonts w:eastAsia="Times New Roman" w:cs="Arial"/>
           <w:lang w:val="es-AR" w:eastAsia="es-AR"/>
         </w:rPr>
-        <w:lastRenderedPageBreak/>
         <w:t>Documentación y cierre</w:t>
       </w:r>
       <w:bookmarkEnd w:id="36"/>
@@ -18758,6 +18700,7 @@
         <w:rPr>
           <w:lang w:val="es-AR" w:eastAsia="es-AR"/>
         </w:rPr>
+        <w:lastRenderedPageBreak/>
         <w:t>Diagrama de Estructura de Desglose de Trabajo (EDT)</w:t>
       </w:r>
       <w:bookmarkEnd w:id="37"/>
@@ -18843,7 +18786,6 @@
           <w:noProof/>
           <w:lang w:val="es-AR" w:eastAsia="es-AR"/>
         </w:rPr>
-        <w:lastRenderedPageBreak/>
         <w:drawing>
           <wp:anchor distT="0" distB="0" distL="114300" distR="114300" simplePos="0" relativeHeight="251655680" behindDoc="0" locked="0" layoutInCell="1" allowOverlap="1" wp14:anchorId="0D168C30">
             <wp:simplePos x="0" y="0"/>
@@ -19661,7 +19603,15 @@
                 <w:rFonts w:ascii="Arial" w:hAnsi="Arial" w:cs="Arial"/>
                 <w:lang w:val="es-AR" w:eastAsia="es-AR"/>
               </w:rPr>
-              <w:t>Alcance del sistema</w:t>
+              <w:t xml:space="preserve">Alcance del </w:t>
+            </w:r>
+            <w:r>
+              <w:rPr>
+                <w:rFonts w:ascii="Arial" w:hAnsi="Arial" w:cs="Arial"/>
+                <w:lang w:val="es-AR" w:eastAsia="es-AR"/>
+              </w:rPr>
+              <w:lastRenderedPageBreak/>
+              <w:t>sistema</w:t>
             </w:r>
           </w:p>
         </w:tc>
@@ -19683,7 +19633,16 @@
                 <w:rFonts w:ascii="Arial" w:hAnsi="Arial" w:cs="Arial"/>
                 <w:lang w:val="es-AR" w:eastAsia="es-AR"/>
               </w:rPr>
-              <w:t>Definición de los límites del sistema y funcionalidades incluidas/excluidas.</w:t>
+              <w:lastRenderedPageBreak/>
+              <w:t xml:space="preserve">Definición de los límites del </w:t>
+            </w:r>
+            <w:r>
+              <w:rPr>
+                <w:rFonts w:ascii="Arial" w:hAnsi="Arial" w:cs="Arial"/>
+                <w:lang w:val="es-AR" w:eastAsia="es-AR"/>
+              </w:rPr>
+              <w:lastRenderedPageBreak/>
+              <w:t>sistema y funcionalidades incluidas/excluidas.</w:t>
             </w:r>
           </w:p>
         </w:tc>
@@ -19705,7 +19664,16 @@
                 <w:rFonts w:ascii="Arial" w:hAnsi="Arial" w:cs="Arial"/>
                 <w:lang w:val="es-AR" w:eastAsia="es-AR"/>
               </w:rPr>
-              <w:t>Alcance documentado y sin ambigüedades.</w:t>
+              <w:lastRenderedPageBreak/>
+              <w:t xml:space="preserve">Alcance documentado </w:t>
+            </w:r>
+            <w:r>
+              <w:rPr>
+                <w:rFonts w:ascii="Arial" w:hAnsi="Arial" w:cs="Arial"/>
+                <w:lang w:val="es-AR" w:eastAsia="es-AR"/>
+              </w:rPr>
+              <w:lastRenderedPageBreak/>
+              <w:t>y sin ambigüedades.</w:t>
             </w:r>
           </w:p>
         </w:tc>
@@ -19727,6 +19695,7 @@
                 <w:rFonts w:ascii="Arial" w:hAnsi="Arial" w:cs="Arial"/>
                 <w:lang w:val="es-AR" w:eastAsia="es-AR"/>
               </w:rPr>
+              <w:lastRenderedPageBreak/>
               <w:t>PM</w:t>
             </w:r>
           </w:p>
@@ -20131,7 +20100,6 @@
                 <w:rFonts w:ascii="Arial" w:hAnsi="Arial" w:cs="Arial"/>
                 <w:lang w:val="es-AR" w:eastAsia="es-AR"/>
               </w:rPr>
-              <w:lastRenderedPageBreak/>
               <w:t>4.1</w:t>
             </w:r>
           </w:p>
@@ -21360,6 +21328,7 @@
       </w:pPr>
       <w:bookmarkStart w:id="47" w:name="_Toc230024402"/>
       <w:r>
+        <w:lastRenderedPageBreak/>
         <w:t>Diagrama de Gantt</w:t>
       </w:r>
       <w:bookmarkEnd w:id="47"/>
@@ -21421,7 +21390,6 @@
           <w:rFonts w:ascii="Arial" w:hAnsi="Arial" w:cs="Arial"/>
           <w:noProof/>
         </w:rPr>
-        <w:lastRenderedPageBreak/>
         <w:drawing>
           <wp:anchor distT="0" distB="0" distL="114300" distR="114300" simplePos="0" relativeHeight="251668992" behindDoc="1" locked="0" layoutInCell="1" allowOverlap="1">
             <wp:simplePos x="0" y="0"/>
@@ -21577,6 +21545,7 @@
       </w:pPr>
       <w:bookmarkStart w:id="49" w:name="_Toc230024403"/>
       <w:r>
+        <w:lastRenderedPageBreak/>
         <w:t>Solución Técnica</w:t>
       </w:r>
       <w:bookmarkEnd w:id="49"/>
@@ -21640,16 +21609,7 @@
           <w:sz w:val="22"/>
           <w:szCs w:val="22"/>
         </w:rPr>
-        <w:t xml:space="preserve"> se implementa como una aplicación web moderna basada en una arquitectura tipo SPA (Single Page Application), permitiendo una experiencia de </w:t>
-      </w:r>
-      <w:r>
-        <w:rPr>
-          <w:rFonts w:ascii="Arial" w:hAnsi="Arial" w:cs="Arial"/>
-          <w:sz w:val="22"/>
-          <w:szCs w:val="22"/>
-        </w:rPr>
-        <w:lastRenderedPageBreak/>
-        <w:t>usuario dinámica, fluida y sin recargas completas de página. La interfaz se encarga de la visualización de datos financieros, la interacción del usuario y la comunicación con el backend.</w:t>
+        <w:t xml:space="preserve"> se implementa como una aplicación web moderna basada en una arquitectura tipo SPA (Single Page Application), permitiendo una experiencia de usuario dinámica, fluida y sin recargas completas de página. La interfaz se encarga de la visualización de datos financieros, la interacción del usuario y la comunicación con el backend.</w:t>
       </w:r>
     </w:p>
     <w:p>
@@ -22014,6 +21974,7 @@
           <w:b/>
           <w:bCs w:val="0"/>
         </w:rPr>
+        <w:lastRenderedPageBreak/>
         <w:t>Interacción con la API:</w:t>
       </w:r>
       <w:bookmarkEnd w:id="53"/>
@@ -22059,7 +22020,6 @@
           <w:b/>
           <w:bCs w:val="0"/>
         </w:rPr>
-        <w:lastRenderedPageBreak/>
         <w:t xml:space="preserve">2. </w:t>
       </w:r>
       <w:r>
@@ -22545,6 +22505,7 @@
           <w:sz w:val="22"/>
           <w:szCs w:val="22"/>
         </w:rPr>
+        <w:lastRenderedPageBreak/>
         <w:t>Lógica de negocio:</w:t>
       </w:r>
       <w:bookmarkEnd w:id="57"/>
@@ -22696,8 +22657,7 @@
         <w:rPr>
           <w:rFonts w:ascii="Arial" w:hAnsi="Arial" w:cs="Arial"/>
         </w:rPr>
-        <w:lastRenderedPageBreak/>
-        <w:t>Consumo de datos externos (Yahoo Finance), a través de una capa de caché intermedia, salvo en operaciones críticas (compra/venta) que consultan datos en tiempo real</w:t>
+        <w:t xml:space="preserve">Consumo de datos externos (Yahoo Finance) </w:t>
       </w:r>
     </w:p>
     <w:p>
@@ -22995,6 +22955,7 @@
           <w:sz w:val="22"/>
           <w:szCs w:val="22"/>
         </w:rPr>
+        <w:lastRenderedPageBreak/>
         <w:t>Consideraciones:</w:t>
       </w:r>
       <w:bookmarkEnd w:id="61"/>
@@ -23063,7 +23024,6 @@
           <w:b/>
           <w:bCs w:val="0"/>
         </w:rPr>
-        <w:lastRenderedPageBreak/>
         <w:t xml:space="preserve">5. </w:t>
       </w:r>
       <w:r>
@@ -23294,63 +23254,36 @@
           <w:rStyle w:val="Textoennegrita"/>
           <w:rFonts w:ascii="Arial" w:hAnsi="Arial" w:cs="Arial"/>
         </w:rPr>
-        <w:t xml:space="preserve">Yahoo </w:t>
-      </w:r>
+        <w:t xml:space="preserve">Yahoo Finance </w:t>
+      </w:r>
+      <w:proofErr w:type="spellStart"/>
+      <w:proofErr w:type="gramStart"/>
       <w:r>
         <w:rPr>
           <w:rStyle w:val="Textoennegrita"/>
           <w:rFonts w:ascii="Arial" w:hAnsi="Arial" w:cs="Arial"/>
         </w:rPr>
-        <w:t xml:space="preserve">Escalabilidad y </w:t>
-      </w:r>
-      <w:proofErr w:type="spellStart"/>
-      <w:r>
-        <w:rPr>
-          <w:rStyle w:val="Textoennegrita"/>
-          <w:rFonts w:ascii="Arial" w:hAnsi="Arial" w:cs="Arial"/>
-        </w:rPr>
-        <w:t>Rendimiento</w:t>
-      </w:r>
-      <w:r>
-        <w:rPr>
-          <w:rStyle w:val="Textoennegrita"/>
-          <w:rFonts w:ascii="Arial" w:hAnsi="Arial" w:cs="Arial"/>
-        </w:rPr>
-        <w:t>Finance</w:t>
+        <w:t>API</w:t>
+      </w:r>
+      <w:r>
+        <w:rPr>
+          <w:rFonts w:ascii="Arial" w:hAnsi="Arial" w:cs="Arial"/>
+        </w:rPr>
+        <w:t>:Utilizada</w:t>
       </w:r>
       <w:proofErr w:type="spellEnd"/>
-      <w:r>
-        <w:rPr>
-          <w:rStyle w:val="Textoennegrita"/>
-          <w:rFonts w:ascii="Arial" w:hAnsi="Arial" w:cs="Arial"/>
-        </w:rPr>
-        <w:t xml:space="preserve"> API: </w:t>
-      </w:r>
-      <w:r>
-        <w:rPr>
-          <w:rStyle w:val="Textoennegrita"/>
-          <w:rFonts w:ascii="Arial" w:hAnsi="Arial" w:cs="Arial"/>
-          <w:b w:val="0"/>
-        </w:rPr>
-        <w:t>Utilizada para obtener información actualizada de activos financieros, incluyendo precios y variaciones, mediante llamadas HTTP desde el backend.</w:t>
-      </w:r>
-    </w:p>
-    <w:p>
-      <w:pPr>
-        <w:widowControl/>
-        <w:numPr>
-          <w:ilvl w:val="0"/>
-          <w:numId w:val="45"/>
-        </w:numPr>
-        <w:autoSpaceDE/>
-        <w:autoSpaceDN/>
-        <w:spacing w:before="100" w:beforeAutospacing="1" w:after="100" w:afterAutospacing="1" w:line="480" w:lineRule="auto"/>
-        <w:rPr>
-          <w:rFonts w:ascii="Arial" w:hAnsi="Arial" w:cs="Arial"/>
-        </w:rPr>
-      </w:pPr>
-      <w:r>
-        <w:t>Para optimizar este consumo, los datos de mercado no se solicitan directamente al proveedor en cada request, sino que se obtienen a través de una capa de caché intermedia que se actualiza periódicamente (intervalo configurable, actualmente cada 3 minutos). Esto permite reducir la cantidad de llamadas a Yahoo Finance y mejorar el rendimiento general del sistema. Las operaciones críticas de compra y venta de activos no utilizan esta caché: siempre consultan datos en tiempo real para garantizar la consistencia de la información.</w:t>
+      <w:proofErr w:type="gramEnd"/>
+      <w:r>
+        <w:rPr>
+          <w:rFonts w:ascii="Arial" w:hAnsi="Arial" w:cs="Arial"/>
+        </w:rPr>
+        <w:t xml:space="preserve"> para obtener información actualizada de activos financieros, incluyendo precios y variaciones. </w:t>
+      </w:r>
+      <w:r>
+        <w:rPr>
+          <w:rFonts w:ascii="Arial" w:hAnsi="Arial" w:cs="Arial"/>
+        </w:rPr>
+        <w:tab/>
       </w:r>
     </w:p>
     <w:p>
@@ -23490,30 +23423,12 @@
     </w:p>
     <w:p>
       <w:pPr>
-        <w:widowControl/>
-        <w:numPr>
-          <w:ilvl w:val="0"/>
-          <w:numId w:val="46"/>
-        </w:numPr>
-        <w:autoSpaceDE/>
-        <w:autoSpaceDN/>
-        <w:spacing w:before="100" w:beforeAutospacing="1" w:after="100" w:afterAutospacing="1" w:line="480" w:lineRule="auto"/>
-        <w:rPr>
-          <w:rFonts w:ascii="Arial" w:hAnsi="Arial" w:cs="Arial"/>
-        </w:rPr>
-      </w:pPr>
-      <w:r>
-        <w:lastRenderedPageBreak/>
-        <w:t>Uso de una capa de caché para los datos de mercado en tiempo real (precios, variaciones, etc.), reduciendo la cantidad de llamadas al proveedor externo (Yahoo Finance) y mejorando la performance general del sistema.</w:t>
-      </w:r>
-    </w:p>
-    <w:p>
-      <w:pPr>
         <w:pStyle w:val="Ttulo2"/>
         <w:ind w:left="0"/>
       </w:pPr>
       <w:bookmarkStart w:id="65" w:name="_Toc230024419"/>
       <w:r>
+        <w:lastRenderedPageBreak/>
         <w:t xml:space="preserve">8. </w:t>
       </w:r>
       <w:r>
@@ -23576,7 +23491,6 @@
       <w:r>
         <w:rPr>
           <w:rFonts w:ascii="Arial" w:hAnsi="Arial" w:cs="Arial"/>
-          <w:noProof/>
         </w:rPr>
         <w:drawing>
           <wp:inline distT="0" distB="0" distL="0" distR="0" wp14:anchorId="63FC3D59" wp14:editId="5197D098">
@@ -23705,6 +23619,7 @@
           <w:b/>
           <w:bCs/>
         </w:rPr>
+        <w:lastRenderedPageBreak/>
         <w:t>Diseño de Alto Nivel (HLD)</w:t>
       </w:r>
       <w:bookmarkEnd w:id="67"/>
@@ -24112,7 +24027,6 @@
           <w:rStyle w:val="Textoennegrita"/>
           <w:rFonts w:ascii="Arial" w:hAnsi="Arial" w:cs="Arial"/>
         </w:rPr>
-        <w:lastRenderedPageBreak/>
         <w:t>Lógica Cliente:</w:t>
       </w:r>
       <w:r>
@@ -24176,6 +24090,7 @@
         <w:rPr>
           <w:rFonts w:ascii="Arial" w:hAnsi="Arial" w:cs="Arial"/>
         </w:rPr>
+        <w:lastRenderedPageBreak/>
         <w:t>M</w:t>
       </w:r>
       <w:r>
@@ -24714,7 +24629,6 @@
         <w:rPr>
           <w:rFonts w:ascii="Arial" w:hAnsi="Arial" w:cs="Arial"/>
         </w:rPr>
-        <w:lastRenderedPageBreak/>
         <w:t xml:space="preserve">Manejo global de errores </w:t>
       </w:r>
     </w:p>
@@ -24782,6 +24696,7 @@
           <w:rStyle w:val="Textoennegrita"/>
           <w:rFonts w:ascii="Arial" w:hAnsi="Arial" w:cs="Arial"/>
         </w:rPr>
+        <w:lastRenderedPageBreak/>
         <w:t>Servicios (Lógica de Negocio):</w:t>
       </w:r>
       <w:r>
@@ -25292,32 +25207,41 @@
           <w:rStyle w:val="Textoennegrita"/>
           <w:rFonts w:ascii="Arial" w:hAnsi="Arial" w:cs="Arial"/>
         </w:rPr>
-        <w:lastRenderedPageBreak/>
-        <w:t>Integraciones Exte</w:t>
-      </w:r>
-      <w:bookmarkStart w:id="74" w:name="_GoBack"/>
-      <w:bookmarkEnd w:id="74"/>
+        <w:t>Integraciones Externas:</w:t>
+      </w:r>
       <w:r>
         <w:rPr>
           <w:rStyle w:val="Textoennegrita"/>
           <w:rFonts w:ascii="Arial" w:hAnsi="Arial" w:cs="Arial"/>
         </w:rPr>
-        <w:t xml:space="preserve">rnas: </w:t>
-      </w:r>
-      <w:r>
-        <w:rPr>
-          <w:rStyle w:val="Textoennegrita"/>
-          <w:rFonts w:ascii="Arial" w:hAnsi="Arial" w:cs="Arial"/>
-          <w:b w:val="0"/>
-        </w:rPr>
-        <w:t>Consumo de datos financieros mediante Yahoo Finance API utilizando HttpClient, a través de una capa de caché intermedia que minimiza la dependencia directa y continua con este proveedor.</w:t>
+        <w:t xml:space="preserve"> </w:t>
+      </w:r>
+      <w:r>
+        <w:rPr>
+          <w:rFonts w:ascii="Arial" w:hAnsi="Arial" w:cs="Arial"/>
+        </w:rPr>
+        <w:t xml:space="preserve">Consumo de datos financieros mediante Yahoo Finance API utilizando </w:t>
+      </w:r>
+      <w:proofErr w:type="spellStart"/>
+      <w:r>
+        <w:rPr>
+          <w:rFonts w:ascii="Arial" w:hAnsi="Arial" w:cs="Arial"/>
+        </w:rPr>
+        <w:t>HttpClient</w:t>
+      </w:r>
+      <w:proofErr w:type="spellEnd"/>
+      <w:r>
+        <w:rPr>
+          <w:rFonts w:ascii="Arial" w:hAnsi="Arial" w:cs="Arial"/>
+        </w:rPr>
+        <w:t xml:space="preserve">. </w:t>
       </w:r>
     </w:p>
     <w:p>
       <w:pPr>
         <w:pStyle w:val="Ttulo2"/>
       </w:pPr>
-      <w:bookmarkStart w:id="75" w:name="_Toc230024427"/>
+      <w:bookmarkStart w:id="74" w:name="_Toc230024427"/>
       <w:r>
         <w:rPr>
           <w:rStyle w:val="Textoennegrita"/>
@@ -25325,9 +25249,10 @@
           <w:b/>
           <w:bCs w:val="0"/>
         </w:rPr>
+        <w:lastRenderedPageBreak/>
         <w:t>4. Capa de Datos (Persistencia)</w:t>
       </w:r>
-      <w:bookmarkEnd w:id="75"/>
+      <w:bookmarkEnd w:id="74"/>
     </w:p>
     <w:p>
       <w:pPr>
@@ -25350,7 +25275,7 @@
         <w:pStyle w:val="Ttulo3"/>
         <w:ind w:left="717"/>
       </w:pPr>
-      <w:bookmarkStart w:id="76" w:name="_Toc230024428"/>
+      <w:bookmarkStart w:id="75" w:name="_Toc230024428"/>
       <w:r>
         <w:rPr>
           <w:rStyle w:val="Textoennegrita"/>
@@ -25359,7 +25284,7 @@
         </w:rPr>
         <w:t>Motores:</w:t>
       </w:r>
-      <w:bookmarkEnd w:id="76"/>
+      <w:bookmarkEnd w:id="75"/>
     </w:p>
     <w:p>
       <w:pPr>
@@ -25433,7 +25358,7 @@
         <w:spacing w:line="480" w:lineRule="auto"/>
         <w:ind w:left="720"/>
       </w:pPr>
-      <w:bookmarkStart w:id="77" w:name="_Toc230024429"/>
+      <w:bookmarkStart w:id="76" w:name="_Toc230024429"/>
       <w:r>
         <w:rPr>
           <w:rStyle w:val="Textoennegrita"/>
@@ -25442,7 +25367,7 @@
         </w:rPr>
         <w:t>Estructura (Nivel Alto):</w:t>
       </w:r>
-      <w:bookmarkEnd w:id="77"/>
+      <w:bookmarkEnd w:id="76"/>
     </w:p>
     <w:p>
       <w:pPr>
@@ -25732,7 +25657,6 @@
         <w:rPr>
           <w:rFonts w:ascii="Arial" w:hAnsi="Arial" w:cs="Arial"/>
         </w:rPr>
-        <w:lastRenderedPageBreak/>
         <w:t xml:space="preserve">datos de alto volumen optimizados para consulta </w:t>
       </w:r>
     </w:p>
@@ -25740,7 +25664,7 @@
       <w:pPr>
         <w:pStyle w:val="Ttulo2"/>
       </w:pPr>
-      <w:bookmarkStart w:id="78" w:name="_Toc230024430"/>
+      <w:bookmarkStart w:id="77" w:name="_Toc230024430"/>
       <w:r>
         <w:rPr>
           <w:rStyle w:val="Textoennegrita"/>
@@ -25750,7 +25674,7 @@
         </w:rPr>
         <w:t>5. Flujo de Datos Típico (Ej: Generación de Alerta)</w:t>
       </w:r>
-      <w:bookmarkEnd w:id="78"/>
+      <w:bookmarkEnd w:id="77"/>
     </w:p>
     <w:p>
       <w:pPr>
@@ -25855,6 +25779,7 @@
           <w:rStyle w:val="Textoennegrita"/>
           <w:rFonts w:ascii="Arial" w:hAnsi="Arial" w:cs="Arial"/>
         </w:rPr>
+        <w:lastRenderedPageBreak/>
         <w:t>Controlador:</w:t>
       </w:r>
       <w:r>
@@ -26054,7 +25979,7 @@
       <w:pPr>
         <w:pStyle w:val="Ttulo2"/>
       </w:pPr>
-      <w:bookmarkStart w:id="79" w:name="_Toc230024431"/>
+      <w:bookmarkStart w:id="78" w:name="_Toc230024431"/>
       <w:r>
         <w:rPr>
           <w:rStyle w:val="Textoennegrita"/>
@@ -26064,7 +25989,7 @@
         </w:rPr>
         <w:t>6. Infraestructura de Despliegue</w:t>
       </w:r>
-      <w:bookmarkEnd w:id="79"/>
+      <w:bookmarkEnd w:id="78"/>
     </w:p>
     <w:p>
       <w:pPr>
@@ -26226,21 +26151,17 @@
         <w:pStyle w:val="Ttulo2"/>
         <w:spacing w:line="480" w:lineRule="auto"/>
       </w:pPr>
-      <w:bookmarkStart w:id="80" w:name="_Toc230024432"/>
-      <w:r>
-        <w:lastRenderedPageBreak/>
+      <w:bookmarkStart w:id="79" w:name="_Toc230024432"/>
+      <w:r>
         <w:t xml:space="preserve">7. Diagrama </w:t>
       </w:r>
       <w:r>
         <w:t>HDL</w:t>
       </w:r>
-      <w:bookmarkEnd w:id="80"/>
-    </w:p>
-    <w:p>
-      <w:r>
-        <w:rPr>
-          <w:noProof/>
-        </w:rPr>
+      <w:bookmarkEnd w:id="79"/>
+    </w:p>
+    <w:p>
+      <w:r>
         <w:drawing>
           <wp:inline distT="0" distB="0" distL="0" distR="0" wp14:anchorId="4884D8F1" wp14:editId="2DF84554">
             <wp:extent cx="5949950" cy="3248025"/>
@@ -26309,14 +26230,14 @@
       <w:r>
         <w:t xml:space="preserve"> </w:t>
       </w:r>
-      <w:bookmarkStart w:id="81" w:name="_Toc230024466"/>
+      <w:bookmarkStart w:id="80" w:name="_Toc230024466"/>
       <w:r>
         <w:t xml:space="preserve">- </w:t>
       </w:r>
       <w:r>
         <w:t>Diagrama HDL</w:t>
       </w:r>
-      <w:bookmarkEnd w:id="81"/>
+      <w:bookmarkEnd w:id="80"/>
     </w:p>
     <w:p>
       <w:pPr>
@@ -26352,14 +26273,15 @@
           <w:lang w:val="es-AR"/>
         </w:rPr>
       </w:pPr>
-      <w:bookmarkStart w:id="82" w:name="_Toc230024433"/>
-      <w:r>
-        <w:rPr>
-          <w:lang w:val="es-AR"/>
-        </w:rPr>
+      <w:bookmarkStart w:id="81" w:name="_Toc230024433"/>
+      <w:r>
+        <w:rPr>
+          <w:lang w:val="es-AR"/>
+        </w:rPr>
+        <w:lastRenderedPageBreak/>
         <w:t>Modelo de Datos</w:t>
       </w:r>
-      <w:bookmarkEnd w:id="82"/>
+      <w:bookmarkEnd w:id="81"/>
     </w:p>
     <w:p>
       <w:pPr>
@@ -26370,7 +26292,7 @@
           <w:lang w:val="es-AR"/>
         </w:rPr>
       </w:pPr>
-      <w:bookmarkStart w:id="83" w:name="_Toc230024434"/>
+      <w:bookmarkStart w:id="82" w:name="_Toc230024434"/>
       <w:r>
         <w:rPr>
           <w:lang w:val="es-AR"/>
@@ -26397,7 +26319,7 @@
         </w:rPr>
         <w:t>)</w:t>
       </w:r>
-      <w:bookmarkEnd w:id="83"/>
+      <w:bookmarkEnd w:id="82"/>
     </w:p>
     <w:p>
       <w:pPr>
@@ -26408,14 +26330,14 @@
           <w:lang w:val="es-AR"/>
         </w:rPr>
       </w:pPr>
-      <w:bookmarkStart w:id="84" w:name="_Toc230024435"/>
+      <w:bookmarkStart w:id="83" w:name="_Toc230024435"/>
       <w:r>
         <w:rPr>
           <w:lang w:val="es-AR"/>
         </w:rPr>
         <w:t>Entidades Relacionales</w:t>
       </w:r>
-      <w:bookmarkEnd w:id="84"/>
+      <w:bookmarkEnd w:id="83"/>
       <w:r>
         <w:rPr>
           <w:lang w:val="es-AR"/>
@@ -26569,7 +26491,6 @@
           <w:bCs/>
           <w:lang w:val="es-AR"/>
         </w:rPr>
-        <w:lastRenderedPageBreak/>
         <w:t>TRANSACTIONS:</w:t>
       </w:r>
       <w:r>
@@ -26585,11 +26506,11 @@
         <w:pStyle w:val="Ttulo3"/>
         <w:ind w:firstLine="720"/>
       </w:pPr>
-      <w:bookmarkStart w:id="85" w:name="_Toc230024436"/>
+      <w:bookmarkStart w:id="84" w:name="_Toc230024436"/>
       <w:r>
         <w:t>Entidades de Configuración y Preferencias</w:t>
       </w:r>
-      <w:bookmarkEnd w:id="85"/>
+      <w:bookmarkEnd w:id="84"/>
     </w:p>
     <w:p>
       <w:pPr>
@@ -26632,14 +26553,14 @@
           <w:lang w:val="es-AR"/>
         </w:rPr>
       </w:pPr>
-      <w:bookmarkStart w:id="86" w:name="_Toc230024437"/>
+      <w:bookmarkStart w:id="85" w:name="_Toc230024437"/>
       <w:r>
         <w:rPr>
           <w:lang w:val="es-AR"/>
         </w:rPr>
         <w:t>Entidades de Seguimiento</w:t>
       </w:r>
-      <w:bookmarkEnd w:id="86"/>
+      <w:bookmarkEnd w:id="85"/>
     </w:p>
     <w:p>
       <w:pPr>
@@ -26690,14 +26611,14 @@
           <w:lang w:val="es-AR"/>
         </w:rPr>
       </w:pPr>
-      <w:bookmarkStart w:id="87" w:name="_Toc230024438"/>
+      <w:bookmarkStart w:id="86" w:name="_Toc230024438"/>
       <w:r>
         <w:rPr>
           <w:lang w:val="es-AR"/>
         </w:rPr>
         <w:t>Entidades de Alertas y Notificaciones</w:t>
       </w:r>
-      <w:bookmarkEnd w:id="87"/>
+      <w:bookmarkEnd w:id="86"/>
     </w:p>
     <w:p>
       <w:pPr>
@@ -26773,14 +26694,15 @@
           <w:lang w:val="es-AR"/>
         </w:rPr>
       </w:pPr>
-      <w:bookmarkStart w:id="88" w:name="_Toc230024439"/>
-      <w:r>
-        <w:rPr>
-          <w:lang w:val="es-AR"/>
-        </w:rPr>
+      <w:bookmarkStart w:id="87" w:name="_Toc230024439"/>
+      <w:r>
+        <w:rPr>
+          <w:lang w:val="es-AR"/>
+        </w:rPr>
+        <w:lastRenderedPageBreak/>
         <w:t>Entidades de Seguridad y Autenticación</w:t>
       </w:r>
-      <w:bookmarkEnd w:id="88"/>
+      <w:bookmarkEnd w:id="87"/>
     </w:p>
     <w:p>
       <w:pPr>
@@ -26856,14 +26778,14 @@
           <w:lang w:val="es-AR"/>
         </w:rPr>
       </w:pPr>
-      <w:bookmarkStart w:id="89" w:name="_Toc230024440"/>
+      <w:bookmarkStart w:id="88" w:name="_Toc230024440"/>
       <w:r>
         <w:rPr>
           <w:lang w:val="es-AR"/>
         </w:rPr>
         <w:t>Entidades Independientes</w:t>
       </w:r>
-      <w:bookmarkEnd w:id="89"/>
+      <w:bookmarkEnd w:id="88"/>
     </w:p>
     <w:p>
       <w:pPr>
@@ -26905,12 +26827,11 @@
           <w:lang w:val="es-AR"/>
         </w:rPr>
       </w:pPr>
-      <w:bookmarkStart w:id="90" w:name="_Toc230024441"/>
-      <w:r>
-        <w:rPr>
-          <w:lang w:val="es-AR"/>
-        </w:rPr>
-        <w:lastRenderedPageBreak/>
+      <w:bookmarkStart w:id="89" w:name="_Toc230024441"/>
+      <w:r>
+        <w:rPr>
+          <w:lang w:val="es-AR"/>
+        </w:rPr>
         <w:t xml:space="preserve">2. </w:t>
       </w:r>
       <w:r>
@@ -26919,7 +26840,7 @@
         </w:rPr>
         <w:t>Modelo No Relacional (MongoDB)</w:t>
       </w:r>
-      <w:bookmarkEnd w:id="90"/>
+      <w:bookmarkEnd w:id="89"/>
     </w:p>
     <w:p>
       <w:pPr>
@@ -27224,12 +27145,12 @@
           <w:numId w:val="70"/>
         </w:numPr>
       </w:pPr>
-      <w:bookmarkStart w:id="91" w:name="_Toc230024442"/>
+      <w:bookmarkStart w:id="90" w:name="_Toc230024442"/>
       <w:r>
         <w:lastRenderedPageBreak/>
         <w:t>Diagrama DER</w:t>
       </w:r>
-      <w:bookmarkEnd w:id="91"/>
+      <w:bookmarkEnd w:id="90"/>
     </w:p>
     <w:p>
       <w:pPr>
@@ -27320,14 +27241,14 @@
       <w:r>
         <w:t xml:space="preserve"> </w:t>
       </w:r>
-      <w:bookmarkStart w:id="92" w:name="_Toc230024467"/>
+      <w:bookmarkStart w:id="91" w:name="_Toc230024467"/>
       <w:r>
         <w:t xml:space="preserve">- </w:t>
       </w:r>
       <w:r>
         <w:t>Diagrama DER</w:t>
       </w:r>
-      <w:bookmarkEnd w:id="92"/>
+      <w:bookmarkEnd w:id="91"/>
     </w:p>
     <w:p>
       <w:pPr>
@@ -27346,7 +27267,7 @@
           <w:lang w:val="es-AR"/>
         </w:rPr>
       </w:pPr>
-      <w:bookmarkStart w:id="93" w:name="_Toc230024443"/>
+      <w:bookmarkStart w:id="92" w:name="_Toc230024443"/>
       <w:r>
         <w:rPr>
           <w:lang w:val="es-AR"/>
@@ -27354,7 +27275,7 @@
         <w:lastRenderedPageBreak/>
         <w:t>Costos del Proyecto</w:t>
       </w:r>
-      <w:bookmarkEnd w:id="93"/>
+      <w:bookmarkEnd w:id="92"/>
     </w:p>
     <w:p>
       <w:pPr>
@@ -27481,14 +27402,14 @@
           <w:lang w:val="es-AR"/>
         </w:rPr>
       </w:pPr>
-      <w:bookmarkStart w:id="94" w:name="_Toc230024444"/>
+      <w:bookmarkStart w:id="93" w:name="_Toc230024444"/>
       <w:r>
         <w:rPr>
           <w:lang w:val="es-AR"/>
         </w:rPr>
         <w:t>1. Costos de Desarrollo (Recursos Humanos)</w:t>
       </w:r>
-      <w:bookmarkEnd w:id="94"/>
+      <w:bookmarkEnd w:id="93"/>
     </w:p>
     <w:p>
       <w:pPr>
@@ -27516,7 +27437,7 @@
           <w:lang w:val="es-AR"/>
         </w:rPr>
       </w:pPr>
-      <w:bookmarkStart w:id="95" w:name="_Toc230024445"/>
+      <w:bookmarkStart w:id="94" w:name="_Toc230024445"/>
       <w:r>
         <w:rPr>
           <w:lang w:val="es-AR"/>
@@ -27529,7 +27450,7 @@
         </w:rPr>
         <w:t>Estimación de esfuerzo</w:t>
       </w:r>
-      <w:bookmarkEnd w:id="95"/>
+      <w:bookmarkEnd w:id="94"/>
     </w:p>
     <w:p>
       <w:pPr>
@@ -27591,7 +27512,7 @@
           <w:lang w:val="es-AR"/>
         </w:rPr>
       </w:pPr>
-      <w:bookmarkStart w:id="96" w:name="_Toc230024446"/>
+      <w:bookmarkStart w:id="95" w:name="_Toc230024446"/>
       <w:r>
         <w:rPr>
           <w:lang w:val="es-AR"/>
@@ -27604,7 +27525,7 @@
         </w:rPr>
         <w:t>Tarifa por hora</w:t>
       </w:r>
-      <w:bookmarkEnd w:id="96"/>
+      <w:bookmarkEnd w:id="95"/>
     </w:p>
     <w:p>
       <w:pPr>
@@ -27666,7 +27587,7 @@
           <w:lang w:val="es-AR"/>
         </w:rPr>
       </w:pPr>
-      <w:bookmarkStart w:id="97" w:name="_Toc230024447"/>
+      <w:bookmarkStart w:id="96" w:name="_Toc230024447"/>
       <w:r>
         <w:rPr>
           <w:lang w:val="es-AR"/>
@@ -27680,7 +27601,7 @@
         </w:rPr>
         <w:t>Cálculo del costo</w:t>
       </w:r>
-      <w:bookmarkEnd w:id="97"/>
+      <w:bookmarkEnd w:id="96"/>
     </w:p>
     <w:p>
       <w:pPr>
@@ -27798,14 +27719,14 @@
           <w:lang w:val="es-AR"/>
         </w:rPr>
       </w:pPr>
-      <w:bookmarkStart w:id="98" w:name="_Toc230024448"/>
+      <w:bookmarkStart w:id="97" w:name="_Toc230024448"/>
       <w:r>
         <w:rPr>
           <w:lang w:val="es-AR"/>
         </w:rPr>
         <w:t>2. Costos de Infraestructura y Operación</w:t>
       </w:r>
-      <w:bookmarkEnd w:id="98"/>
+      <w:bookmarkEnd w:id="97"/>
     </w:p>
     <w:p>
       <w:pPr>
@@ -27833,14 +27754,14 @@
           <w:lang w:val="es-AR"/>
         </w:rPr>
       </w:pPr>
-      <w:bookmarkStart w:id="99" w:name="_Toc230024449"/>
+      <w:bookmarkStart w:id="98" w:name="_Toc230024449"/>
       <w:r>
         <w:rPr>
           <w:lang w:val="es-AR"/>
         </w:rPr>
         <w:t>2.1 Hosting (Backend + API)</w:t>
       </w:r>
-      <w:bookmarkEnd w:id="99"/>
+      <w:bookmarkEnd w:id="98"/>
     </w:p>
     <w:p>
       <w:pPr>
@@ -28113,14 +28034,14 @@
           <w:lang w:val="es-AR"/>
         </w:rPr>
       </w:pPr>
-      <w:bookmarkStart w:id="100" w:name="_Toc230024450"/>
+      <w:bookmarkStart w:id="99" w:name="_Toc230024450"/>
       <w:r>
         <w:rPr>
           <w:lang w:val="es-AR"/>
         </w:rPr>
         <w:t>2.2 Base de Datos</w:t>
       </w:r>
-      <w:bookmarkEnd w:id="100"/>
+      <w:bookmarkEnd w:id="99"/>
     </w:p>
     <w:p>
       <w:pPr>
@@ -28409,7 +28330,7 @@
           <w:lang w:val="es-AR"/>
         </w:rPr>
       </w:pPr>
-      <w:bookmarkStart w:id="101" w:name="_Toc230024451"/>
+      <w:bookmarkStart w:id="100" w:name="_Toc230024451"/>
       <w:r>
         <w:rPr>
           <w:lang w:val="es-AR"/>
@@ -28417,7 +28338,7 @@
         <w:lastRenderedPageBreak/>
         <w:t>2.3 Dominio Web (opcional)</w:t>
       </w:r>
-      <w:bookmarkEnd w:id="101"/>
+      <w:bookmarkEnd w:id="100"/>
     </w:p>
     <w:p>
       <w:pPr>
@@ -28649,14 +28570,14 @@
           <w:lang w:val="es-AR"/>
         </w:rPr>
       </w:pPr>
-      <w:bookmarkStart w:id="102" w:name="_Toc230024452"/>
+      <w:bookmarkStart w:id="101" w:name="_Toc230024452"/>
       <w:r>
         <w:rPr>
           <w:lang w:val="es-AR"/>
         </w:rPr>
         <w:t>2.4 Herramientas y Software</w:t>
       </w:r>
-      <w:bookmarkEnd w:id="102"/>
+      <w:bookmarkEnd w:id="101"/>
     </w:p>
     <w:p>
       <w:pPr>
@@ -28841,14 +28762,14 @@
           <w:lang w:val="es-AR"/>
         </w:rPr>
       </w:pPr>
-      <w:bookmarkStart w:id="103" w:name="_Toc230024453"/>
+      <w:bookmarkStart w:id="102" w:name="_Toc230024453"/>
       <w:r>
         <w:rPr>
           <w:lang w:val="es-AR"/>
         </w:rPr>
         <w:t>3. Costos de Integraciones Externas</w:t>
       </w:r>
-      <w:bookmarkEnd w:id="103"/>
+      <w:bookmarkEnd w:id="102"/>
     </w:p>
     <w:p>
       <w:pPr>
@@ -28955,7 +28876,7 @@
           <w:lang w:val="es-AR"/>
         </w:rPr>
       </w:pPr>
-      <w:bookmarkStart w:id="104" w:name="_Toc230024454"/>
+      <w:bookmarkStart w:id="103" w:name="_Toc230024454"/>
       <w:r>
         <w:rPr>
           <w:lang w:val="es-AR"/>
@@ -28969,7 +28890,7 @@
         </w:rPr>
         <w:t>Contenerización</w:t>
       </w:r>
-      <w:bookmarkEnd w:id="104"/>
+      <w:bookmarkEnd w:id="103"/>
       <w:proofErr w:type="spellEnd"/>
     </w:p>
     <w:p>
@@ -29102,7 +29023,7 @@
           <w:lang w:val="es-AR"/>
         </w:rPr>
       </w:pPr>
-      <w:bookmarkStart w:id="105" w:name="_Toc230024455"/>
+      <w:bookmarkStart w:id="104" w:name="_Toc230024455"/>
       <w:r>
         <w:rPr>
           <w:lang w:val="es-AR"/>
@@ -29110,7 +29031,7 @@
         <w:lastRenderedPageBreak/>
         <w:t>5. Costos de Contingencia</w:t>
       </w:r>
-      <w:bookmarkEnd w:id="105"/>
+      <w:bookmarkEnd w:id="104"/>
     </w:p>
     <w:p>
       <w:pPr>
@@ -29212,14 +29133,14 @@
           <w:lang w:val="es-AR"/>
         </w:rPr>
       </w:pPr>
-      <w:bookmarkStart w:id="106" w:name="_Toc230024456"/>
+      <w:bookmarkStart w:id="105" w:name="_Toc230024456"/>
       <w:r>
         <w:rPr>
           <w:lang w:val="es-AR"/>
         </w:rPr>
         <w:t>6. Resumen Económico</w:t>
       </w:r>
-      <w:bookmarkEnd w:id="106"/>
+      <w:bookmarkEnd w:id="105"/>
     </w:p>
     <w:tbl>
       <w:tblPr>
@@ -29726,7 +29647,7 @@
           <w:lang w:val="es-AR"/>
         </w:rPr>
       </w:pPr>
-      <w:bookmarkStart w:id="107" w:name="_Toc230024470"/>
+      <w:bookmarkStart w:id="106" w:name="_Toc230024470"/>
       <w:r>
         <w:t xml:space="preserve">Tabla </w:t>
       </w:r>
@@ -29754,7 +29675,7 @@
       <w:r>
         <w:t>Resumen Económico</w:t>
       </w:r>
-      <w:bookmarkEnd w:id="107"/>
+      <w:bookmarkEnd w:id="106"/>
     </w:p>
     <w:p>
       <w:pPr>
@@ -29764,14 +29685,14 @@
           <w:lang w:val="es-AR"/>
         </w:rPr>
       </w:pPr>
-      <w:bookmarkStart w:id="108" w:name="_Toc230024457"/>
+      <w:bookmarkStart w:id="107" w:name="_Toc230024457"/>
       <w:r>
         <w:rPr>
           <w:lang w:val="es-AR"/>
         </w:rPr>
         <w:t>7. Conclusión</w:t>
       </w:r>
-      <w:bookmarkEnd w:id="108"/>
+      <w:bookmarkEnd w:id="107"/>
     </w:p>
     <w:p>
       <w:pPr>
@@ -29842,7 +29763,10 @@
     <w:p/>
     <w:p/>
     <w:p/>
-    <w:p/>
+    <w:p>
+      <w:bookmarkStart w:id="108" w:name="_GoBack"/>
+      <w:bookmarkEnd w:id="108"/>
+    </w:p>
     <w:p>
       <w:pPr>
         <w:pStyle w:val="Ttulo1"/>
@@ -30558,9 +30482,6 @@
         <w:spacing w:line="480" w:lineRule="auto"/>
       </w:pPr>
       <w:r>
-        <w:rPr>
-          <w:noProof/>
-        </w:rPr>
         <w:drawing>
           <wp:anchor distT="0" distB="0" distL="114300" distR="114300" simplePos="0" relativeHeight="251672064" behindDoc="0" locked="0" layoutInCell="1" allowOverlap="1" wp14:anchorId="7CDA66F3">
             <wp:simplePos x="0" y="0"/>
@@ -42142,7 +42063,6 @@
   <w:style w:type="character" w:default="1" w:styleId="Fuentedeprrafopredeter">
     <w:name w:val="Default Paragraph Font"/>
     <w:uiPriority w:val="1"/>
-    <w:semiHidden/>
     <w:unhideWhenUsed/>
   </w:style>
   <w:style w:type="table" w:default="1" w:styleId="Tablanormal">
@@ -42944,7 +42864,7 @@
 </file>
 
 <file path=customXml/itemProps1.xml><?xml version="1.0" encoding="utf-8"?>
-<ds:datastoreItem xmlns:ds="http://schemas.openxmlformats.org/officeDocument/2006/customXml" ds:itemID="{1C086330-7E3E-4621-B368-818950CEEF8C}">
+<ds:datastoreItem xmlns:ds="http://schemas.openxmlformats.org/officeDocument/2006/customXml" ds:itemID="{69E88F4B-37F3-47BC-BCC0-AA6651F4FB2F}">
   <ds:schemaRefs>
     <ds:schemaRef ds:uri="http://schemas.openxmlformats.org/officeDocument/2006/bibliography"/>
   </ds:schemaRefs>

</xml_diff>